<commit_message>
docs: tighten storyboard to exactly 5:00 with impactful merged closing scene
Merged Scene 8 (The Build) and Scene 9 (Outro) into a single 30s Scene 8
'The Future' — fast montage into school gate exterior, closing on three
stripped-back lines that call back to Scene 1. 8 scenes, 5:00 total.

Co-Authored-By: Claude Sonnet 4.6 <noreply@anthropic.com>
</commit_message>
<xml_diff>
--- a/STORYBOARD - Project Sandy.docx
+++ b/STORYBOARD - Project Sandy.docx
@@ -2,7 +2,7 @@
 <file path=word/document.xml><?xml version="1.0" encoding="utf-8"?>
 <w:document xmlns:w="http://schemas.openxmlformats.org/wordprocessingml/2006/main" xmlns:m="http://schemas.openxmlformats.org/officeDocument/2006/math" xmlns:r="http://schemas.openxmlformats.org/officeDocument/2006/relationships" xmlns:o="urn:schemas-microsoft-com:office:office" xmlns:v="urn:schemas-microsoft-com:vml" xmlns:w10="urn:schemas-microsoft-com:office:word" xmlns:a="http://schemas.openxmlformats.org/drawingml/2006/main" xmlns:pic="http://schemas.openxmlformats.org/drawingml/2006/picture" xmlns:wp="http://schemas.openxmlformats.org/drawingml/2006/wordprocessingDrawing">
   <w:body>
-    <w:bookmarkStart w:id="36" w:name="X8ea3ef3ef966522f065c2e0bd69463138ced585"/>
+    <w:bookmarkStart w:id="35" w:name="X8ea3ef3ef966522f065c2e0bd69463138ced585"/>
     <w:p>
       <w:pPr>
         <w:pStyle w:val="Heading1"/>
@@ -40,7 +40,7 @@
         <w:t xml:space="preserve"> </w:t>
       </w:r>
       <w:r>
-        <w:t xml:space="preserve">· Total Runtime: ~5:30 · 9 Scenes</w:t>
+        <w:t xml:space="preserve">· Total Runtime: 5:00 · 8 Scenes</w:t>
       </w:r>
     </w:p>
     <w:p>
@@ -482,73 +482,49 @@
           <w:bCs/>
           <w:b/>
         </w:rPr>
-        <w:t xml:space="preserve">Scene 8 — The Build (4:30 – 5:00)</w:t>
-      </w:r>
-      <w:r>
-        <w:t xml:space="preserve"> </w:t>
-      </w:r>
-      <w:r>
-        <w:t xml:space="preserve">Sandy didn’t appear overnight. It was designed and built from the ground up by a team of six students — as a capstone AI project.</w:t>
-      </w:r>
-      <w:r>
-        <w:t xml:space="preserve"> </w:t>
-      </w:r>
-      <w:r>
-        <w:t xml:space="preserve">Using React for the interface, Django for the backend, and DeepFace for the facial recognition engine — every single feature was planned, debated, coded, and tested collaboratively.</w:t>
-      </w:r>
-      <w:r>
-        <w:t xml:space="preserve"> </w:t>
-      </w:r>
-      <w:r>
-        <w:t xml:space="preserve">Version-controlled on GitHub. Refined through real testing. Six minds. One shared goal.</w:t>
-      </w:r>
-      <w:r>
-        <w:t xml:space="preserve"> </w:t>
-      </w:r>
-      <w:r>
-        <w:t xml:space="preserve">Build something that actually works — for real schools, and real students.</w:t>
-      </w:r>
-    </w:p>
-    <w:p>
-      <w:pPr>
-        <w:pStyle w:val="BodyText"/>
-      </w:pPr>
-      <w:r>
-        <w:rPr>
-          <w:bCs/>
-          <w:b/>
-        </w:rPr>
-        <w:t xml:space="preserve">Scene 9 — The Outro (5:00 – 5:30)</w:t>
-      </w:r>
-      <w:r>
-        <w:t xml:space="preserve"> </w:t>
-      </w:r>
-      <w:r>
-        <w:t xml:space="preserve">And that is Project Sandy — a smarter way to manage attendance, registration, and school safety. By replacing paper registers with facial recognition, Sandy helps teachers save time, reduce mistakes, and keep student records organised.</w:t>
-      </w:r>
-      <w:r>
-        <w:t xml:space="preserve"> </w:t>
-      </w:r>
-      <w:r>
-        <w:t xml:space="preserve">As we continue developing the app, our goal is to bring Sandy into schools across Barbados — including Alma Parris, Ellerslie Secondary, and other primary and secondary schools right here at home.</w:t>
-      </w:r>
-      <w:r>
-        <w:t xml:space="preserve"> </w:t>
-      </w:r>
-      <w:r>
-        <w:t xml:space="preserve">And with future security features on the way, Sandy will help schools create safer, faster, and more efficient learning environments.</w:t>
-      </w:r>
-      <w:r>
-        <w:t xml:space="preserve"> </w:t>
-      </w:r>
-      <w:r>
-        <w:t xml:space="preserve">Because Project Sandy is not just attendance — it is the future of smarter schools.</w:t>
-      </w:r>
-      <w:r>
-        <w:t xml:space="preserve"> </w:t>
-      </w:r>
-      <w:r>
-        <w:t xml:space="preserve">Thank you.</w:t>
+        <w:t xml:space="preserve">Scene 8 — The Future (4:30 – 5:00)</w:t>
+      </w:r>
+      <w:r>
+        <w:t xml:space="preserve"> </w:t>
+      </w:r>
+      <w:r>
+        <w:t xml:space="preserve">Sandy was built from scratch — by six students, one team, one shared goal.</w:t>
+      </w:r>
+      <w:r>
+        <w:t xml:space="preserve"> </w:t>
+      </w:r>
+      <w:r>
+        <w:t xml:space="preserve">React. Django. DeepFace AI. Months of code, real testing, and genuine collaboration — for classrooms that still run on paper.</w:t>
+      </w:r>
+      <w:r>
+        <w:t xml:space="preserve"> </w:t>
+      </w:r>
+      <w:r>
+        <w:t xml:space="preserve">Our mission is to bring Sandy to every school in Barbados. Alma Parris. Ellerslie Secondary. Every student. Every morning.</w:t>
+      </w:r>
+      <w:r>
+        <w:t xml:space="preserve"> </w:t>
+      </w:r>
+      <w:r>
+        <w:t xml:space="preserve">Because no student should ever be missed.</w:t>
+      </w:r>
+      <w:r>
+        <w:t xml:space="preserve"> </w:t>
+      </w:r>
+      <w:r>
+        <w:t xml:space="preserve">Every face matters.</w:t>
+      </w:r>
+      <w:r>
+        <w:t xml:space="preserve"> </w:t>
+      </w:r>
+      <w:r>
+        <w:t xml:space="preserve">Every day counts.</w:t>
+      </w:r>
+      <w:r>
+        <w:t xml:space="preserve"> </w:t>
+      </w:r>
+      <w:r>
+        <w:t xml:space="preserve">This is Project Sandy.</w:t>
       </w:r>
     </w:p>
     <w:p>
@@ -559,7 +535,7 @@
       </w:r>
     </w:p>
     <w:bookmarkEnd w:id="20"/>
-    <w:bookmarkStart w:id="30" w:name="scene-by-scene-production-package"/>
+    <w:bookmarkStart w:id="29" w:name="scene-by-scene-production-package"/>
     <w:p>
       <w:pPr>
         <w:pStyle w:val="Heading2"/>
@@ -1790,13 +1766,13 @@
       </w:r>
     </w:p>
     <w:bookmarkEnd w:id="27"/>
-    <w:bookmarkStart w:id="28" w:name="scene-8-the-build"/>
+    <w:bookmarkStart w:id="28" w:name="scene-8-the-future"/>
     <w:p>
       <w:pPr>
         <w:pStyle w:val="Heading3"/>
       </w:pPr>
       <w:r>
-        <w:t xml:space="preserve">Scene 8 — The Build</w:t>
+        <w:t xml:space="preserve">Scene 8 — The Future</w:t>
       </w:r>
     </w:p>
     <w:p>
@@ -1830,7 +1806,7 @@
         <w:t xml:space="preserve"> </w:t>
       </w:r>
       <w:r>
-        <w:t xml:space="preserve">Built by students. For schools.</w:t>
+        <w:t xml:space="preserve">Every face matters. Every day counts.</w:t>
       </w:r>
     </w:p>
     <w:p>
@@ -1848,7 +1824,7 @@
         <w:t xml:space="preserve"> </w:t>
       </w:r>
       <w:r>
-        <w:t xml:space="preserve">Quick-cut documentary montage. Shot 1: A group of six young adults (university students, mixed backgrounds) gathered around laptops in a bright study space — screens showing code and the Sandy interface. Collaborative energy — someone pointing at a screen, another typing. Shot 2: Close-up of a laptop showing GitHub — commit history, green contribution graph, branch names. Shot 3: A whiteboard covered in architecture diagrams — React, Django, DeepFace written in marker. Shot 4: The Sandy interface loading on a laptop — the finished product. Each shot is 5–6 seconds. Clean, rhythmic cuts. Warm natural light throughout.</w:t>
+        <w:t xml:space="preserve">Opens with a rapid 3-shot montage — the team at laptops (2s), a GitHub commit graph (2s), a whiteboard with React / Django / DeepFace written in marker (2s). Then a hard cut to silence: wide exterior shot of a Caribbean school gate at morning. Students filing in, uniforms, sunlight. The voice-over slows and lands each final line with weight. On the last word — cut to black. White text appears one line at a time, centre screen:</w:t>
       </w:r>
     </w:p>
     <w:p>
@@ -1857,6 +1833,106 @@
       </w:pPr>
       <w:r>
         <w:rPr>
+          <w:iCs/>
+          <w:i/>
+        </w:rPr>
+        <w:t xml:space="preserve">“</w:t>
+      </w:r>
+      <w:r>
+        <w:rPr>
+          <w:iCs/>
+          <w:i/>
+        </w:rPr>
+        <w:t xml:space="preserve">Every face matters.</w:t>
+      </w:r>
+      <w:r>
+        <w:rPr>
+          <w:iCs/>
+          <w:i/>
+        </w:rPr>
+        <w:t xml:space="preserve">”</w:t>
+      </w:r>
+      <w:r>
+        <w:t xml:space="preserve"> </w:t>
+      </w:r>
+      <w:r>
+        <w:rPr>
+          <w:iCs/>
+          <w:i/>
+        </w:rPr>
+        <w:t xml:space="preserve">“</w:t>
+      </w:r>
+      <w:r>
+        <w:rPr>
+          <w:iCs/>
+          <w:i/>
+        </w:rPr>
+        <w:t xml:space="preserve">Every day counts.</w:t>
+      </w:r>
+      <w:r>
+        <w:rPr>
+          <w:iCs/>
+          <w:i/>
+        </w:rPr>
+        <w:t xml:space="preserve">”</w:t>
+      </w:r>
+      <w:r>
+        <w:t xml:space="preserve"> </w:t>
+      </w:r>
+      <w:r>
+        <w:rPr>
+          <w:iCs/>
+          <w:i/>
+        </w:rPr>
+        <w:t xml:space="preserve">“</w:t>
+      </w:r>
+      <w:r>
+        <w:rPr>
+          <w:iCs/>
+          <w:i/>
+        </w:rPr>
+        <w:t xml:space="preserve">This is Project Sandy.</w:t>
+      </w:r>
+      <w:r>
+        <w:rPr>
+          <w:iCs/>
+          <w:i/>
+        </w:rPr>
+        <w:t xml:space="preserve">”</w:t>
+      </w:r>
+    </w:p>
+    <w:p>
+      <w:pPr>
+        <w:pStyle w:val="BodyText"/>
+      </w:pPr>
+      <w:r>
+        <w:t xml:space="preserve">Smaller text below:</w:t>
+      </w:r>
+      <w:r>
+        <w:t xml:space="preserve"> </w:t>
+      </w:r>
+      <w:r>
+        <w:rPr>
+          <w:iCs/>
+          <w:i/>
+        </w:rPr>
+        <w:t xml:space="preserve">Alma Parris School · Ellerslie Secondary · Barbados</w:t>
+      </w:r>
+    </w:p>
+    <w:p>
+      <w:pPr>
+        <w:pStyle w:val="BodyText"/>
+      </w:pPr>
+      <w:r>
+        <w:t xml:space="preserve">Hold 3 seconds. Fade out completely.</w:t>
+      </w:r>
+    </w:p>
+    <w:p>
+      <w:pPr>
+        <w:pStyle w:val="BodyText"/>
+      </w:pPr>
+      <w:r>
+        <w:rPr>
           <w:bCs/>
           <w:b/>
         </w:rPr>
@@ -1866,7 +1942,7 @@
         <w:t xml:space="preserve"> </w:t>
       </w:r>
       <w:r>
-        <w:t xml:space="preserve">Wide group shot → GitHub screen → whiteboard → finished app on screen.</w:t>
+        <w:t xml:space="preserve">Fast montage (team / GitHub / whiteboard) → hard cut to school gate wide → slow push in → cut to black → title cards.</w:t>
       </w:r>
     </w:p>
     <w:p>
@@ -1884,7 +1960,7 @@
         <w:t xml:space="preserve"> </w:t>
       </w:r>
       <w:r>
-        <w:t xml:space="preserve">Behind-the-scenes pride. Real people. A real project. Earned — not bought.</w:t>
+        <w:t xml:space="preserve">Pride, purpose, inevitability. The audience feels this was earned — and that it is just beginning.</w:t>
       </w:r>
     </w:p>
     <w:p>
@@ -1911,7 +1987,7 @@
         <w:t xml:space="preserve">“</w:t>
       </w:r>
       <w:r>
-        <w:t xml:space="preserve">Six students. One shared goal.</w:t>
+        <w:t xml:space="preserve">Six students. One team. One goal.</w:t>
       </w:r>
       <w:r>
         <w:t xml:space="preserve">”</w:t>
@@ -1947,7 +2023,7 @@
         <w:t xml:space="preserve">“</w:t>
       </w:r>
       <w:r>
-        <w:t xml:space="preserve">Designed, built, and tested — from scratch.</w:t>
+        <w:t xml:space="preserve">Every face matters. Every day counts.</w:t>
       </w:r>
       <w:r>
         <w:t xml:space="preserve">”</w:t>
@@ -1965,7 +2041,7 @@
         <w:t xml:space="preserve">“</w:t>
       </w:r>
       <w:r>
-        <w:t xml:space="preserve">Built by students. For schools.</w:t>
+        <w:t xml:space="preserve">This is Project Sandy.</w:t>
       </w:r>
       <w:r>
         <w:t xml:space="preserve">”</w:t>
@@ -1979,279 +2055,8 @@
       </w:r>
     </w:p>
     <w:bookmarkEnd w:id="28"/>
-    <w:bookmarkStart w:id="29" w:name="scene-9-the-outro"/>
-    <w:p>
-      <w:pPr>
-        <w:pStyle w:val="Heading3"/>
-      </w:pPr>
-      <w:r>
-        <w:t xml:space="preserve">Scene 9 — The Outro</w:t>
-      </w:r>
-    </w:p>
-    <w:p>
-      <w:pPr>
-        <w:pStyle w:val="FirstParagraph"/>
-      </w:pPr>
-      <w:r>
-        <w:rPr>
-          <w:bCs/>
-          <w:b/>
-        </w:rPr>
-        <w:t xml:space="preserve">Duration:</w:t>
-      </w:r>
-      <w:r>
-        <w:t xml:space="preserve"> </w:t>
-      </w:r>
-      <w:r>
-        <w:t xml:space="preserve">30 seconds (5:00–5:30)</w:t>
-      </w:r>
-      <w:r>
-        <w:t xml:space="preserve"> </w:t>
-      </w:r>
-      <w:r>
-        <w:rPr>
-          <w:bCs/>
-          <w:b/>
-        </w:rPr>
-        <w:t xml:space="preserve">Caption:</w:t>
-      </w:r>
-      <w:r>
-        <w:t xml:space="preserve"> </w:t>
-      </w:r>
-      <w:r>
-        <w:t xml:space="preserve">The future of smarter schools.</w:t>
-      </w:r>
-    </w:p>
-    <w:p>
-      <w:pPr>
-        <w:pStyle w:val="BodyText"/>
-      </w:pPr>
-      <w:r>
-        <w:rPr>
-          <w:bCs/>
-          <w:b/>
-        </w:rPr>
-        <w:t xml:space="preserve">Visual:</w:t>
-      </w:r>
-      <w:r>
-        <w:t xml:space="preserve"> </w:t>
-      </w:r>
-      <w:r>
-        <w:t xml:space="preserve">Slow fade from black. Wide exterior shot of a school — students arriving through the gate in the morning light, uniforms, movement, life. Voice-over plays over the image, calm and final. Gentle fade to black. White text appears on black screen, one line at a time:</w:t>
-      </w:r>
-    </w:p>
-    <w:p>
-      <w:pPr>
-        <w:pStyle w:val="BodyText"/>
-      </w:pPr>
-      <w:r>
-        <w:rPr>
-          <w:iCs/>
-          <w:i/>
-        </w:rPr>
-        <w:t xml:space="preserve">“</w:t>
-      </w:r>
-      <w:r>
-        <w:rPr>
-          <w:iCs/>
-          <w:i/>
-        </w:rPr>
-        <w:t xml:space="preserve">Project Sandy</w:t>
-      </w:r>
-      <w:r>
-        <w:rPr>
-          <w:iCs/>
-          <w:i/>
-        </w:rPr>
-        <w:t xml:space="preserve">”</w:t>
-      </w:r>
-      <w:r>
-        <w:t xml:space="preserve"> </w:t>
-      </w:r>
-      <w:r>
-        <w:rPr>
-          <w:iCs/>
-          <w:i/>
-        </w:rPr>
-        <w:t xml:space="preserve">“</w:t>
-      </w:r>
-      <w:r>
-        <w:rPr>
-          <w:iCs/>
-          <w:i/>
-        </w:rPr>
-        <w:t xml:space="preserve">FR Attendance</w:t>
-      </w:r>
-      <w:r>
-        <w:rPr>
-          <w:iCs/>
-          <w:i/>
-        </w:rPr>
-        <w:t xml:space="preserve">”</w:t>
-      </w:r>
-      <w:r>
-        <w:t xml:space="preserve"> </w:t>
-      </w:r>
-      <w:r>
-        <w:rPr>
-          <w:iCs/>
-          <w:i/>
-        </w:rPr>
-        <w:t xml:space="preserve">“</w:t>
-      </w:r>
-      <w:r>
-        <w:rPr>
-          <w:iCs/>
-          <w:i/>
-        </w:rPr>
-        <w:t xml:space="preserve">The future of smarter schools.</w:t>
-      </w:r>
-      <w:r>
-        <w:rPr>
-          <w:iCs/>
-          <w:i/>
-        </w:rPr>
-        <w:t xml:space="preserve">”</w:t>
-      </w:r>
-    </w:p>
-    <w:p>
-      <w:pPr>
-        <w:pStyle w:val="BodyText"/>
-      </w:pPr>
-      <w:r>
-        <w:t xml:space="preserve">Smaller text below:</w:t>
-      </w:r>
-      <w:r>
-        <w:t xml:space="preserve"> </w:t>
-      </w:r>
-      <w:r>
-        <w:rPr>
-          <w:iCs/>
-          <w:i/>
-        </w:rPr>
-        <w:t xml:space="preserve">Alma Parris School · Ellerslie Secondary · Barbados</w:t>
-      </w:r>
-    </w:p>
-    <w:p>
-      <w:pPr>
-        <w:pStyle w:val="BodyText"/>
-      </w:pPr>
-      <w:r>
-        <w:t xml:space="preserve">Hold 3 seconds. Fade out.</w:t>
-      </w:r>
-    </w:p>
-    <w:p>
-      <w:pPr>
-        <w:pStyle w:val="BodyText"/>
-      </w:pPr>
-      <w:r>
-        <w:rPr>
-          <w:bCs/>
-          <w:b/>
-        </w:rPr>
-        <w:t xml:space="preserve">Camera:</w:t>
-      </w:r>
-      <w:r>
-        <w:t xml:space="preserve"> </w:t>
-      </w:r>
-      <w:r>
-        <w:t xml:space="preserve">Exterior wide → fade to black → title card.</w:t>
-      </w:r>
-    </w:p>
-    <w:p>
-      <w:pPr>
-        <w:pStyle w:val="BodyText"/>
-      </w:pPr>
-      <w:r>
-        <w:rPr>
-          <w:bCs/>
-          <w:b/>
-        </w:rPr>
-        <w:t xml:space="preserve">Mood:</w:t>
-      </w:r>
-      <w:r>
-        <w:t xml:space="preserve"> </w:t>
-      </w:r>
-      <w:r>
-        <w:t xml:space="preserve">Hopeful, proud, conclusive.</w:t>
-      </w:r>
-    </w:p>
-    <w:p>
-      <w:pPr>
-        <w:pStyle w:val="BodyText"/>
-      </w:pPr>
-      <w:r>
-        <w:rPr>
-          <w:bCs/>
-          <w:b/>
-        </w:rPr>
-        <w:t xml:space="preserve">Caption sequence:</w:t>
-      </w:r>
-      <w:r>
-        <w:t xml:space="preserve"> </w:t>
-      </w:r>
-      <w:r>
-        <w:t xml:space="preserve">-</w:t>
-      </w:r>
-      <w:r>
-        <w:t xml:space="preserve"> </w:t>
-      </w:r>
-      <w:r>
-        <w:t xml:space="preserve">“</w:t>
-      </w:r>
-      <w:r>
-        <w:t xml:space="preserve">Safer. Faster. Smarter.</w:t>
-      </w:r>
-      <w:r>
-        <w:t xml:space="preserve">”</w:t>
-      </w:r>
-      <w:r>
-        <w:t xml:space="preserve"> </w:t>
-      </w:r>
-      <w:r>
-        <w:t xml:space="preserve">-</w:t>
-      </w:r>
-      <w:r>
-        <w:t xml:space="preserve"> </w:t>
-      </w:r>
-      <w:r>
-        <w:t xml:space="preserve">“</w:t>
-      </w:r>
-      <w:r>
-        <w:t xml:space="preserve">Project Sandy.</w:t>
-      </w:r>
-      <w:r>
-        <w:t xml:space="preserve">”</w:t>
-      </w:r>
-      <w:r>
-        <w:t xml:space="preserve"> </w:t>
-      </w:r>
-      <w:r>
-        <w:t xml:space="preserve">-</w:t>
-      </w:r>
-      <w:r>
-        <w:t xml:space="preserve"> </w:t>
-      </w:r>
-      <w:r>
-        <w:t xml:space="preserve">“</w:t>
-      </w:r>
-      <w:r>
-        <w:t xml:space="preserve">The future of smarter schools.</w:t>
-      </w:r>
-      <w:r>
-        <w:t xml:space="preserve">”</w:t>
-      </w:r>
-    </w:p>
-    <w:p>
-      <w:r>
-        <w:pict>
-          <v:rect style="width:0;height:1.5pt" o:hralign="center" o:hrstd="t" o:hr="t"/>
-        </w:pict>
-      </w:r>
-    </w:p>
     <w:bookmarkEnd w:id="29"/>
-    <w:bookmarkEnd w:id="30"/>
-    <w:bookmarkStart w:id="31" w:name="scene-summary-table"/>
+    <w:bookmarkStart w:id="30" w:name="scene-summary-table"/>
     <w:p>
       <w:pPr>
         <w:pStyle w:val="Heading2"/>
@@ -2742,7 +2547,7 @@
               <w:jc w:val="left"/>
             </w:pPr>
             <w:r>
-              <w:t xml:space="preserve">The Build</w:t>
+              <w:t xml:space="preserve">The Future</w:t>
             </w:r>
           </w:p>
         </w:tc>
@@ -2775,64 +2580,7 @@
               <w:jc w:val="left"/>
             </w:pPr>
             <w:r>
-              <w:t xml:space="preserve">The team and technology behind Sandy</w:t>
-            </w:r>
-          </w:p>
-        </w:tc>
-      </w:tr>
-      <w:tr>
-        <w:tc>
-          <w:p>
-            <w:pPr>
-              <w:pStyle w:val="Compact"/>
-              <w:jc w:val="left"/>
-            </w:pPr>
-            <w:r>
-              <w:t xml:space="preserve">9</w:t>
-            </w:r>
-          </w:p>
-        </w:tc>
-        <w:tc>
-          <w:p>
-            <w:pPr>
-              <w:pStyle w:val="Compact"/>
-              <w:jc w:val="left"/>
-            </w:pPr>
-            <w:r>
-              <w:t xml:space="preserve">The Outro</w:t>
-            </w:r>
-          </w:p>
-        </w:tc>
-        <w:tc>
-          <w:p>
-            <w:pPr>
-              <w:pStyle w:val="Compact"/>
-              <w:jc w:val="left"/>
-            </w:pPr>
-            <w:r>
-              <w:t xml:space="preserve">5:00–5:30</w:t>
-            </w:r>
-          </w:p>
-        </w:tc>
-        <w:tc>
-          <w:p>
-            <w:pPr>
-              <w:pStyle w:val="Compact"/>
-              <w:jc w:val="left"/>
-            </w:pPr>
-            <w:r>
-              <w:t xml:space="preserve">30s</w:t>
-            </w:r>
-          </w:p>
-        </w:tc>
-        <w:tc>
-          <w:p>
-            <w:pPr>
-              <w:pStyle w:val="Compact"/>
-              <w:jc w:val="left"/>
-            </w:pPr>
-            <w:r>
-              <w:t xml:space="preserve">Vision for Barbados schools</w:t>
+              <w:t xml:space="preserve">The team, the vision, the closing statement</w:t>
             </w:r>
           </w:p>
         </w:tc>
@@ -2870,7 +2618,7 @@
                 <w:bCs/>
                 <w:b/>
               </w:rPr>
-              <w:t xml:space="preserve">5:30</w:t>
+              <w:t xml:space="preserve">5:00</w:t>
             </w:r>
           </w:p>
         </w:tc>
@@ -2886,8 +2634,8 @@
         </w:pict>
       </w:r>
     </w:p>
-    <w:bookmarkEnd w:id="31"/>
-    <w:bookmarkStart w:id="32" w:name="elevenlabs-voice-settings"/>
+    <w:bookmarkEnd w:id="30"/>
+    <w:bookmarkStart w:id="31" w:name="elevenlabs-voice-settings"/>
     <w:p>
       <w:pPr>
         <w:pStyle w:val="Heading2"/>
@@ -2905,7 +2653,7 @@
           <w:bCs/>
           <w:b/>
         </w:rPr>
-        <w:t xml:space="preserve">Scenes 1–7 and Scene 8:</w:t>
+        <w:t xml:space="preserve">Scenes 1–7:</w:t>
       </w:r>
       <w:r>
         <w:t xml:space="preserve"> </w:t>
@@ -2941,19 +2689,19 @@
           <w:bCs/>
           <w:b/>
         </w:rPr>
-        <w:t xml:space="preserve">Scene 9 — Outro (slightly slower and calmer):</w:t>
-      </w:r>
-      <w:r>
-        <w:t xml:space="preserve"> </w:t>
-      </w:r>
-      <w:r>
-        <w:t xml:space="preserve">- Speed: 0.91</w:t>
-      </w:r>
-      <w:r>
-        <w:t xml:space="preserve"> </w:t>
-      </w:r>
-      <w:r>
-        <w:t xml:space="preserve">- Stability: 65%</w:t>
+        <w:t xml:space="preserve">Scene 8 — The Future (slower and weighted for impact):</w:t>
+      </w:r>
+      <w:r>
+        <w:t xml:space="preserve"> </w:t>
+      </w:r>
+      <w:r>
+        <w:t xml:space="preserve">- Speed: 0.89</w:t>
+      </w:r>
+      <w:r>
+        <w:t xml:space="preserve"> </w:t>
+      </w:r>
+      <w:r>
+        <w:t xml:space="preserve">- Stability: 68%</w:t>
       </w:r>
       <w:r>
         <w:t xml:space="preserve"> </w:t>
@@ -2965,7 +2713,7 @@
         <w:t xml:space="preserve"> </w:t>
       </w:r>
       <w:r>
-        <w:t xml:space="preserve">- Style: 28%</w:t>
+        <w:t xml:space="preserve">- Style: 30%</w:t>
       </w:r>
     </w:p>
     <w:p>
@@ -2975,8 +2723,8 @@
         </w:pict>
       </w:r>
     </w:p>
-    <w:bookmarkEnd w:id="32"/>
-    <w:bookmarkStart w:id="35" w:name="how-to-produce-the-video"/>
+    <w:bookmarkEnd w:id="31"/>
+    <w:bookmarkStart w:id="34" w:name="how-to-produce-the-video"/>
     <w:p>
       <w:pPr>
         <w:pStyle w:val="Heading2"/>
@@ -2985,7 +2733,7 @@
         <w:t xml:space="preserve">How to Produce the Video</w:t>
       </w:r>
     </w:p>
-    <w:bookmarkStart w:id="33" w:name="tools"/>
+    <w:bookmarkStart w:id="32" w:name="tools"/>
     <w:p>
       <w:pPr>
         <w:pStyle w:val="Heading3"/>
@@ -3149,8 +2897,8 @@
         </w:tc>
       </w:tr>
     </w:tbl>
-    <w:bookmarkEnd w:id="33"/>
-    <w:bookmarkStart w:id="34" w:name="workflow"/>
+    <w:bookmarkEnd w:id="32"/>
+    <w:bookmarkStart w:id="33" w:name="workflow"/>
     <w:p>
       <w:pPr>
         <w:pStyle w:val="Heading3"/>
@@ -3259,7 +3007,7 @@
           <w:iCs/>
           <w:i/>
         </w:rPr>
-        <w:t xml:space="preserve">Project Sandy — Storyboard &amp; Production Package v2.0</w:t>
+        <w:t xml:space="preserve">Project Sandy — Storyboard &amp; Production Package v3.0</w:t>
       </w:r>
       <w:r>
         <w:t xml:space="preserve"> </w:t>
@@ -3269,12 +3017,12 @@
           <w:iCs/>
           <w:i/>
         </w:rPr>
-        <w:t xml:space="preserve">Updated to include development scene — 9 scenes, 5:30 runtime</w:t>
-      </w:r>
-    </w:p>
+        <w:t xml:space="preserve">8 scenes, exactly 5:00 runtime — development scene merged into closing</w:t>
+      </w:r>
+    </w:p>
+    <w:bookmarkEnd w:id="33"/>
     <w:bookmarkEnd w:id="34"/>
     <w:bookmarkEnd w:id="35"/>
-    <w:bookmarkEnd w:id="36"/>
     <w:sectPr/>
   </w:body>
 </w:document>

</xml_diff>

<commit_message>
feat: Railway deployment config and production-ready settings
- Add gunicorn and whitenoise to requirements.txt
- Add WhiteNoiseMiddleware for static file serving
- Configure STATIC_ROOT, WHITENOISE_ROOT to serve React dist/ build
- Add catch-all SPA route in urls.py for client-side routing
- Add Procfile, railway.json, nixpacks.toml for Railway deployment
- Update .gitignore to exclude staticfiles/ build artefacts
- Storyboard v4: tribute to Sandy Samuels woven into Scene 8 closing

Co-Authored-By: Claude Sonnet 4.6 <noreply@anthropic.com>
</commit_message>
<xml_diff>
--- a/STORYBOARD - Project Sandy.docx
+++ b/STORYBOARD - Project Sandy.docx
@@ -482,31 +482,31 @@
           <w:bCs/>
           <w:b/>
         </w:rPr>
-        <w:t xml:space="preserve">Scene 8 — The Future (4:30 – 5:00)</w:t>
-      </w:r>
-      <w:r>
-        <w:t xml:space="preserve"> </w:t>
-      </w:r>
-      <w:r>
-        <w:t xml:space="preserve">Sandy was built from scratch — by six students, one team, one shared goal.</w:t>
-      </w:r>
-      <w:r>
-        <w:t xml:space="preserve"> </w:t>
-      </w:r>
-      <w:r>
-        <w:t xml:space="preserve">React. Django. DeepFace AI. Months of code, real testing, and genuine collaboration — for classrooms that still run on paper.</w:t>
-      </w:r>
-      <w:r>
-        <w:t xml:space="preserve"> </w:t>
-      </w:r>
-      <w:r>
-        <w:t xml:space="preserve">Our mission is to bring Sandy to every school in Barbados. Alma Parris. Ellerslie Secondary. Every student. Every morning.</w:t>
-      </w:r>
-      <w:r>
-        <w:t xml:space="preserve"> </w:t>
-      </w:r>
-      <w:r>
-        <w:t xml:space="preserve">Because no student should ever be missed.</w:t>
+        <w:t xml:space="preserve">Scene 8 — For Sandy (4:30 – 5:00)</w:t>
+      </w:r>
+      <w:r>
+        <w:t xml:space="preserve"> </w:t>
+      </w:r>
+      <w:r>
+        <w:t xml:space="preserve">This app carries a name.</w:t>
+      </w:r>
+      <w:r>
+        <w:t xml:space="preserve"> </w:t>
+      </w:r>
+      <w:r>
+        <w:t xml:space="preserve">Sandy.</w:t>
+      </w:r>
+      <w:r>
+        <w:t xml:space="preserve"> </w:t>
+      </w:r>
+      <w:r>
+        <w:t xml:space="preserve">Not just a project name — a person. Sandy Samuels worked at these schools. She saw the gaps. She brought the idea to our team, and shared her vision with us — just days before she passed away.</w:t>
+      </w:r>
+      <w:r>
+        <w:t xml:space="preserve"> </w:t>
+      </w:r>
+      <w:r>
+        <w:t xml:space="preserve">We built this for her. For every student she believed deserved to be seen, every morning, without fail.</w:t>
       </w:r>
       <w:r>
         <w:t xml:space="preserve"> </w:t>
@@ -1766,13 +1766,13 @@
       </w:r>
     </w:p>
     <w:bookmarkEnd w:id="27"/>
-    <w:bookmarkStart w:id="28" w:name="scene-8-the-future"/>
+    <w:bookmarkStart w:id="28" w:name="scene-8-for-sandy"/>
     <w:p>
       <w:pPr>
         <w:pStyle w:val="Heading3"/>
       </w:pPr>
       <w:r>
-        <w:t xml:space="preserve">Scene 8 — The Future</w:t>
+        <w:t xml:space="preserve">Scene 8 — For Sandy</w:t>
       </w:r>
     </w:p>
     <w:p>
@@ -1806,7 +1806,7 @@
         <w:t xml:space="preserve"> </w:t>
       </w:r>
       <w:r>
-        <w:t xml:space="preserve">Every face matters. Every day counts.</w:t>
+        <w:t xml:space="preserve">This is Project Sandy.</w:t>
       </w:r>
     </w:p>
     <w:p>
@@ -1824,13 +1824,27 @@
         <w:t xml:space="preserve"> </w:t>
       </w:r>
       <w:r>
-        <w:t xml:space="preserve">Opens with a rapid 3-shot montage — the team at laptops (2s), a GitHub commit graph (2s), a whiteboard with React / Django / DeepFace written in marker (2s). Then a hard cut to silence: wide exterior shot of a Caribbean school gate at morning. Students filing in, uniforms, sunlight. The voice-over slows and lands each final line with weight. On the last word — cut to black. White text appears one line at a time, centre screen:</w:t>
-      </w:r>
-    </w:p>
-    <w:p>
-      <w:pPr>
-        <w:pStyle w:val="BodyText"/>
-      </w:pPr>
+        <w:t xml:space="preserve">Hard cut from the dashboard to black. Silence for one beat.</w:t>
+      </w:r>
+    </w:p>
+    <w:p>
+      <w:pPr>
+        <w:pStyle w:val="BodyText"/>
+      </w:pPr>
+      <w:r>
+        <w:t xml:space="preserve">Then: a single still image or soft-focus photograph — a school corridor, an empty classroom desk, morning light through a window. Something quiet and human. The narrator’s voice is slower now, deliberate, like a dedication.</w:t>
+      </w:r>
+    </w:p>
+    <w:p>
+      <w:pPr>
+        <w:pStyle w:val="BodyText"/>
+      </w:pPr>
+      <w:r>
+        <w:t xml:space="preserve">On the word</w:t>
+      </w:r>
+      <w:r>
+        <w:t xml:space="preserve"> </w:t>
+      </w:r>
       <w:r>
         <w:rPr>
           <w:iCs/>
@@ -1843,7 +1857,7 @@
           <w:iCs/>
           <w:i/>
         </w:rPr>
-        <w:t xml:space="preserve">Every face matters.</w:t>
+        <w:t xml:space="preserve">Sandy</w:t>
       </w:r>
       <w:r>
         <w:rPr>
@@ -1856,6 +1870,30 @@
         <w:t xml:space="preserve"> </w:t>
       </w:r>
       <w:r>
+        <w:t xml:space="preserve">— the name appears on screen alone. White text. Black background. One word. Hold it for two seconds before the voice continues.</w:t>
+      </w:r>
+    </w:p>
+    <w:p>
+      <w:pPr>
+        <w:pStyle w:val="BodyText"/>
+      </w:pPr>
+      <w:r>
+        <w:t xml:space="preserve">As the narration closes, cut to: wide exterior of a school gate, students arriving in the early morning. Uniforms. Movement. Life. The scene Sandy saw every day.</w:t>
+      </w:r>
+    </w:p>
+    <w:p>
+      <w:pPr>
+        <w:pStyle w:val="BodyText"/>
+      </w:pPr>
+      <w:r>
+        <w:t xml:space="preserve">Final cut to black. White text appears one line at a time:</w:t>
+      </w:r>
+    </w:p>
+    <w:p>
+      <w:pPr>
+        <w:pStyle w:val="BodyText"/>
+      </w:pPr>
+      <w:r>
         <w:rPr>
           <w:iCs/>
           <w:i/>
@@ -1867,7 +1905,7 @@
           <w:iCs/>
           <w:i/>
         </w:rPr>
-        <w:t xml:space="preserve">Every day counts.</w:t>
+        <w:t xml:space="preserve">Every face matters.</w:t>
       </w:r>
       <w:r>
         <w:rPr>
@@ -1891,7 +1929,7 @@
           <w:iCs/>
           <w:i/>
         </w:rPr>
-        <w:t xml:space="preserve">This is Project Sandy.</w:t>
+        <w:t xml:space="preserve">Every day counts.</w:t>
       </w:r>
       <w:r>
         <w:rPr>
@@ -1900,14 +1938,6 @@
         </w:rPr>
         <w:t xml:space="preserve">”</w:t>
       </w:r>
-    </w:p>
-    <w:p>
-      <w:pPr>
-        <w:pStyle w:val="BodyText"/>
-      </w:pPr>
-      <w:r>
-        <w:t xml:space="preserve">Smaller text below:</w:t>
-      </w:r>
       <w:r>
         <w:t xml:space="preserve"> </w:t>
       </w:r>
@@ -1916,15 +1946,47 @@
           <w:iCs/>
           <w:i/>
         </w:rPr>
-        <w:t xml:space="preserve">Alma Parris School · Ellerslie Secondary · Barbados</w:t>
-      </w:r>
-    </w:p>
-    <w:p>
-      <w:pPr>
-        <w:pStyle w:val="BodyText"/>
-      </w:pPr>
-      <w:r>
-        <w:t xml:space="preserve">Hold 3 seconds. Fade out completely.</w:t>
+        <w:t xml:space="preserve">“</w:t>
+      </w:r>
+      <w:r>
+        <w:rPr>
+          <w:iCs/>
+          <w:i/>
+        </w:rPr>
+        <w:t xml:space="preserve">This is Project Sandy.</w:t>
+      </w:r>
+      <w:r>
+        <w:rPr>
+          <w:iCs/>
+          <w:i/>
+        </w:rPr>
+        <w:t xml:space="preserve">”</w:t>
+      </w:r>
+    </w:p>
+    <w:p>
+      <w:pPr>
+        <w:pStyle w:val="BodyText"/>
+      </w:pPr>
+      <w:r>
+        <w:t xml:space="preserve">Smaller text below:</w:t>
+      </w:r>
+      <w:r>
+        <w:t xml:space="preserve"> </w:t>
+      </w:r>
+      <w:r>
+        <w:rPr>
+          <w:iCs/>
+          <w:i/>
+        </w:rPr>
+        <w:t xml:space="preserve">In memory of Sandy Samuels</w:t>
+      </w:r>
+    </w:p>
+    <w:p>
+      <w:pPr>
+        <w:pStyle w:val="BodyText"/>
+      </w:pPr>
+      <w:r>
+        <w:t xml:space="preserve">Hold 4 seconds. Fade out.</w:t>
       </w:r>
     </w:p>
     <w:p>
@@ -1942,7 +2004,25 @@
         <w:t xml:space="preserve"> </w:t>
       </w:r>
       <w:r>
-        <w:t xml:space="preserve">Fast montage (team / GitHub / whiteboard) → hard cut to school gate wide → slow push in → cut to black → title cards.</w:t>
+        <w:t xml:space="preserve">Cut to black → still image (corridor/desk) → name card</w:t>
+      </w:r>
+      <w:r>
+        <w:t xml:space="preserve"> </w:t>
+      </w:r>
+      <w:r>
+        <w:t xml:space="preserve">“</w:t>
+      </w:r>
+      <w:r>
+        <w:t xml:space="preserve">Sandy</w:t>
+      </w:r>
+      <w:r>
+        <w:t xml:space="preserve">”</w:t>
+      </w:r>
+      <w:r>
+        <w:t xml:space="preserve"> </w:t>
+      </w:r>
+      <w:r>
+        <w:t xml:space="preserve">→ school gate exterior → final title cards.</w:t>
       </w:r>
     </w:p>
     <w:p>
@@ -1960,7 +2040,65 @@
         <w:t xml:space="preserve"> </w:t>
       </w:r>
       <w:r>
-        <w:t xml:space="preserve">Pride, purpose, inevitability. The audience feels this was earned — and that it is just beginning.</w:t>
+        <w:t xml:space="preserve">Still. Earned. The audience realises the name they have been hearing for five minutes belongs to a real person. The app is not a product — it is a promise kept.</w:t>
+      </w:r>
+    </w:p>
+    <w:p>
+      <w:pPr>
+        <w:pStyle w:val="BodyText"/>
+      </w:pPr>
+      <w:r>
+        <w:rPr>
+          <w:bCs/>
+          <w:b/>
+        </w:rPr>
+        <w:t xml:space="preserve">Narration direction:</w:t>
+      </w:r>
+      <w:r>
+        <w:t xml:space="preserve"> </w:t>
+      </w:r>
+      <w:r>
+        <w:t xml:space="preserve">Pause fully after</w:t>
+      </w:r>
+      <w:r>
+        <w:t xml:space="preserve"> </w:t>
+      </w:r>
+      <w:r>
+        <w:rPr>
+          <w:iCs/>
+          <w:i/>
+        </w:rPr>
+        <w:t xml:space="preserve">“</w:t>
+      </w:r>
+      <w:r>
+        <w:rPr>
+          <w:iCs/>
+          <w:i/>
+        </w:rPr>
+        <w:t xml:space="preserve">Sandy.</w:t>
+      </w:r>
+      <w:r>
+        <w:rPr>
+          <w:iCs/>
+          <w:i/>
+        </w:rPr>
+        <w:t xml:space="preserve">”</w:t>
+      </w:r>
+      <w:r>
+        <w:t xml:space="preserve"> </w:t>
+      </w:r>
+      <w:r>
+        <w:t xml:space="preserve">— let it sit. Do not rush the tribute lines. The three closing lines (</w:t>
+      </w:r>
+      <w:r>
+        <w:rPr>
+          <w:iCs/>
+          <w:i/>
+        </w:rPr>
+        <w:t xml:space="preserve">Every face matters. Every day counts. This is Project Sandy.</w:t>
+      </w:r>
+      <w:r>
+        <w:t xml:space="preserve">) should each land on their own breath.</w:t>
       </w:r>
     </w:p>
     <w:p>
@@ -1987,7 +2125,7 @@
         <w:t xml:space="preserve">“</w:t>
       </w:r>
       <w:r>
-        <w:t xml:space="preserve">Six students. One team. One goal.</w:t>
+        <w:t xml:space="preserve">Sandy Samuels — she saw the need.</w:t>
       </w:r>
       <w:r>
         <w:t xml:space="preserve">”</w:t>
@@ -2005,7 +2143,25 @@
         <w:t xml:space="preserve">“</w:t>
       </w:r>
       <w:r>
-        <w:t xml:space="preserve">React. Django. DeepFace AI.</w:t>
+        <w:t xml:space="preserve">She shared the vision. Days later, she was gone.</w:t>
+      </w:r>
+      <w:r>
+        <w:t xml:space="preserve">”</w:t>
+      </w:r>
+      <w:r>
+        <w:t xml:space="preserve"> </w:t>
+      </w:r>
+      <w:r>
+        <w:t xml:space="preserve">-</w:t>
+      </w:r>
+      <w:r>
+        <w:t xml:space="preserve"> </w:t>
+      </w:r>
+      <w:r>
+        <w:t xml:space="preserve">“</w:t>
+      </w:r>
+      <w:r>
+        <w:t xml:space="preserve">We built this for her.</w:t>
       </w:r>
       <w:r>
         <w:t xml:space="preserve">”</w:t>
@@ -2547,7 +2703,7 @@
               <w:jc w:val="left"/>
             </w:pPr>
             <w:r>
-              <w:t xml:space="preserve">The Future</w:t>
+              <w:t xml:space="preserve">For Sandy</w:t>
             </w:r>
           </w:p>
         </w:tc>
@@ -2580,7 +2736,7 @@
               <w:jc w:val="left"/>
             </w:pPr>
             <w:r>
-              <w:t xml:space="preserve">The team, the vision, the closing statement</w:t>
+              <w:t xml:space="preserve">The person behind the name — tribute and close</w:t>
             </w:r>
           </w:p>
         </w:tc>
@@ -2689,19 +2845,19 @@
           <w:bCs/>
           <w:b/>
         </w:rPr>
-        <w:t xml:space="preserve">Scene 8 — The Future (slower and weighted for impact):</w:t>
-      </w:r>
-      <w:r>
-        <w:t xml:space="preserve"> </w:t>
-      </w:r>
-      <w:r>
-        <w:t xml:space="preserve">- Speed: 0.89</w:t>
-      </w:r>
-      <w:r>
-        <w:t xml:space="preserve"> </w:t>
-      </w:r>
-      <w:r>
-        <w:t xml:space="preserve">- Stability: 68%</w:t>
+        <w:t xml:space="preserve">Scene 8 — For Sandy (slow, measured, tribute delivery):</w:t>
+      </w:r>
+      <w:r>
+        <w:t xml:space="preserve"> </w:t>
+      </w:r>
+      <w:r>
+        <w:t xml:space="preserve">- Speed: 0.87</w:t>
+      </w:r>
+      <w:r>
+        <w:t xml:space="preserve"> </w:t>
+      </w:r>
+      <w:r>
+        <w:t xml:space="preserve">- Stability: 72%</w:t>
       </w:r>
       <w:r>
         <w:t xml:space="preserve"> </w:t>
@@ -2713,7 +2869,7 @@
         <w:t xml:space="preserve"> </w:t>
       </w:r>
       <w:r>
-        <w:t xml:space="preserve">- Style: 30%</w:t>
+        <w:t xml:space="preserve">- Style: 32%</w:t>
       </w:r>
     </w:p>
     <w:p>
@@ -3007,7 +3163,7 @@
           <w:iCs/>
           <w:i/>
         </w:rPr>
-        <w:t xml:space="preserve">Project Sandy — Storyboard &amp; Production Package v3.0</w:t>
+        <w:t xml:space="preserve">Project Sandy — Storyboard &amp; Production Package v4.0</w:t>
       </w:r>
       <w:r>
         <w:t xml:space="preserve"> </w:t>
@@ -3017,7 +3173,7 @@
           <w:iCs/>
           <w:i/>
         </w:rPr>
-        <w:t xml:space="preserve">8 scenes, exactly 5:00 runtime — development scene merged into closing</w:t>
+        <w:t xml:space="preserve">8 scenes, exactly 5:00 runtime — dedicated to Sandy Samuels</w:t>
       </w:r>
     </w:p>
     <w:bookmarkEnd w:id="33"/>

</xml_diff>